<commit_message>
fix(analysis): waktu misi T = saat semua survivor tuntas, jam log +1 s
- T diambil dari pesan "AUTO-EXIT: SUCCESS ... centroid", bukan "Total Waktu
  Misi" yang dicetak 3 s kemudian saat node ditutup. T di Tabel 2 turun 3 s
  di tujuh misi yang tuntas; rentang percepatan H-inf tetap 11-15%.
- Baris STATUS ke-i (dari 0) = detik misi ke-(i+1): "Durasi Misi: 187.0s"
  tercetak setelah tepat 186 baris STATUS (konsisten di 7 log). Sumbu waktu
  dan penanda kill di Fig. 6 bergeser +1 s; span tier-2 tidak berubah.
- Audit menambah dua cek (selisih Total-tuntas = 3 s, jam log vs Durasi Misi);
  status tetap LOLOS.
- main.pdf/main_anon.pdf dibangun ulang (8 halaman); kedua .docx v1 memuat T
  baru dan Fig. 6 baru. PDF v1 hasil export Word belum diperbarui.
</commit_message>
<xml_diff>
--- a/docs/Full Paper - EPIC/EPIC2026_FullPaper_Anonymous_v1.docx
+++ b/docs/Full Paper - EPIC/EPIC2026_FullPaper_Anonymous_v1.docx
@@ -7276,7 +7276,7 @@
               <w:rPr>
                 <w:sz w:val="16"/>
               </w:rPr>
-              <w:t>260</w:t>
+              <w:t>257</w:t>
             </w:r>
           </w:p>
         </w:tc>
@@ -7857,7 +7857,7 @@
               <w:rPr>
                 <w:sz w:val="16"/>
               </w:rPr>
-              <w:t>204</w:t>
+              <w:t>201</w:t>
             </w:r>
           </w:p>
         </w:tc>
@@ -8124,7 +8124,7 @@
               <w:rPr>
                 <w:sz w:val="16"/>
               </w:rPr>
-              <w:t>236</w:t>
+              <w:t>233</w:t>
             </w:r>
           </w:p>
         </w:tc>
@@ -8411,7 +8411,7 @@
               <w:rPr>
                 <w:sz w:val="16"/>
               </w:rPr>
-              <w:t>205</w:t>
+              <w:t>202</w:t>
             </w:r>
           </w:p>
         </w:tc>
@@ -8678,7 +8678,7 @@
               <w:rPr>
                 <w:sz w:val="16"/>
               </w:rPr>
-              <w:t>240</w:t>
+              <w:t>237</w:t>
             </w:r>
           </w:p>
         </w:tc>
@@ -8965,7 +8965,7 @@
               <w:rPr>
                 <w:sz w:val="16"/>
               </w:rPr>
-              <w:t>198</w:t>
+              <w:t>195</w:t>
             </w:r>
           </w:p>
         </w:tc>
@@ -9247,7 +9247,7 @@
               <w:rPr>
                 <w:sz w:val="16"/>
               </w:rPr>
-              <w:t>222</w:t>
+              <w:t>219</w:t>
             </w:r>
           </w:p>
         </w:tc>

</xml_diff>

<commit_message>
docs(paper): bersihkan metadata docx versi anonim
</commit_message>
<xml_diff>
--- a/docs/Full Paper - EPIC/EPIC2026_FullPaper_Anonymous_v1.docx
+++ b/docs/Full Paper - EPIC/EPIC2026_FullPaper_Anonymous_v1.docx
@@ -38,13 +38,7 @@
         <w:t>Abstract.</w:t>
       </w:r>
       <w:r>
-        <w:t xml:space="preserve"> </w:t>
-      </w:r>
-      <w:r>
-        <w:t>Surveying a non-convex site with a quadrotor swarm must remain safe and complete when the wind is strong, obstacles are unknown in advance, and agents fail in flight. We present a three-layer architecture for this task. The high level partitions the region by polygon-clipped centroidal Voronoi tessellation, plans boundary-following boustrophedon sweeps and reallocates the unswept lanes of failed agents. The mid level maps obstacles with on-board LiDAR and filters every velocity command through a control bar</w:t>
-      </w:r>
-      <w:r>
-        <w:t xml:space="preserve">rier function quadratic program whose admissible approach-speed function follows from the tilt limit and dead time of the vehicle. The low level is a cascaded PID with gains synthesised from the LQR or the </w:t>
+        <w:t xml:space="preserve"> Surveying a non-convex site with a quadrotor swarm must remain safe and complete when the wind is strong, obstacles are unknown in advance, and agents fail in flight. We present a three-layer architecture for this task. The high level partitions the region by polygon-clipped centroidal Voronoi tessellation, plans boundary-following boustrophedon sweeps and reallocates the unswept lanes of failed agents. The mid level maps obstacles with on-board LiDAR and filters every velocity command through a control barrier function quadratic program whose admissible approach-speed function follows from the tilt limit and dead time of the vehicle. The low level is a cascaded PID with gains synthesised from the LQR or the </w:t>
       </w:r>
       <w:r>
         <w:rPr>
@@ -376,7 +370,7 @@
                     <pic:cNvPicPr/>
                   </pic:nvPicPr>
                   <pic:blipFill>
-                    <a:blip r:embed="rId9"/>
+                    <a:blip r:embed="rId8"/>
                     <a:stretch>
                       <a:fillRect/>
                     </a:stretch>
@@ -475,7 +469,7 @@
                     <pic:cNvPicPr/>
                   </pic:nvPicPr>
                   <pic:blipFill>
-                    <a:blip r:embed="rId10"/>
+                    <a:blip r:embed="rId9"/>
                     <a:stretch>
                       <a:fillRect/>
                     </a:stretch>
@@ -578,13 +572,7 @@
         <w:pStyle w:val="Paragraph"/>
       </w:pPr>
       <w:r>
-        <w:t xml:space="preserve">Given the region polygon </w:t>
-      </w:r>
-      <w:r>
-        <w:t>𝒬</w:t>
-      </w:r>
-      <w:r>
-        <w:t xml:space="preserve"> and generators </w:t>
+        <w:t xml:space="preserve">Given the region polygon 𝒬 and generators </w:t>
       </w:r>
       <w:r>
         <w:rPr>
@@ -679,19 +667,7 @@
                   <w:rPr>
                     <w:rFonts w:ascii="Cambria Math" w:hAnsi="Cambria Math"/>
                   </w:rPr>
-                  <m:t>={</m:t>
-                </m:r>
-                <m:r>
-                  <w:rPr>
-                    <w:rFonts w:ascii="Cambria Math" w:hAnsi="Cambria Math"/>
-                  </w:rPr>
-                  <m:t>q</m:t>
-                </m:r>
-                <m:r>
-                  <w:rPr>
-                    <w:rFonts w:ascii="Cambria Math" w:hAnsi="Cambria Math"/>
-                  </w:rPr>
-                  <m:t>∈</m:t>
+                  <m:t>={q∈</m:t>
                 </m:r>
                 <m:r>
                   <m:rPr>
@@ -700,25 +676,13 @@
                   <w:rPr>
                     <w:rFonts w:ascii="Cambria Math" w:hAnsi="Cambria Math"/>
                   </w:rPr>
-                  <m:t>Q</m:t>
+                  <m:t>Q:‖</m:t>
                 </m:r>
                 <m:r>
                   <w:rPr>
                     <w:rFonts w:ascii="Cambria Math" w:hAnsi="Cambria Math"/>
                   </w:rPr>
-                  <m:t>:‖</m:t>
-                </m:r>
-                <m:r>
-                  <w:rPr>
-                    <w:rFonts w:ascii="Cambria Math" w:hAnsi="Cambria Math"/>
-                  </w:rPr>
-                  <m:t>q</m:t>
-                </m:r>
-                <m:r>
-                  <w:rPr>
-                    <w:rFonts w:ascii="Cambria Math" w:hAnsi="Cambria Math"/>
-                  </w:rPr>
-                  <m:t>-</m:t>
+                  <m:t>q-</m:t>
                 </m:r>
                 <m:sSub>
                   <m:sSubPr>
@@ -749,19 +713,7 @@
                   <w:rPr>
                     <w:rFonts w:ascii="Cambria Math" w:hAnsi="Cambria Math"/>
                   </w:rPr>
-                  <m:t>‖≤‖</m:t>
-                </m:r>
-                <m:r>
-                  <w:rPr>
-                    <w:rFonts w:ascii="Cambria Math" w:hAnsi="Cambria Math"/>
-                  </w:rPr>
-                  <m:t>q</m:t>
-                </m:r>
-                <m:r>
-                  <w:rPr>
-                    <w:rFonts w:ascii="Cambria Math" w:hAnsi="Cambria Math"/>
-                  </w:rPr>
-                  <m:t>-</m:t>
+                  <m:t>‖≤‖q-</m:t>
                 </m:r>
                 <m:sSub>
                   <m:sSubPr>
@@ -804,31 +756,7 @@
                   <w:rPr>
                     <w:rFonts w:ascii="Cambria Math" w:hAnsi="Cambria Math"/>
                   </w:rPr>
-                  <m:t>∀</m:t>
-                </m:r>
-                <m:r>
-                  <w:rPr>
-                    <w:rFonts w:ascii="Cambria Math" w:hAnsi="Cambria Math"/>
-                  </w:rPr>
-                  <m:t>j</m:t>
-                </m:r>
-                <m:r>
-                  <w:rPr>
-                    <w:rFonts w:ascii="Cambria Math" w:hAnsi="Cambria Math"/>
-                  </w:rPr>
-                  <m:t>≠</m:t>
-                </m:r>
-                <m:r>
-                  <w:rPr>
-                    <w:rFonts w:ascii="Cambria Math" w:hAnsi="Cambria Math"/>
-                  </w:rPr>
-                  <m:t>i</m:t>
-                </m:r>
-                <m:r>
-                  <w:rPr>
-                    <w:rFonts w:ascii="Cambria Math" w:hAnsi="Cambria Math"/>
-                  </w:rPr>
-                  <m:t>},</m:t>
+                  <m:t>∀j≠i},</m:t>
                 </m:r>
               </m:oMath>
             </m:oMathPara>
@@ -881,13 +809,7 @@
         <w:ind w:firstLine="0"/>
       </w:pPr>
       <w:r>
-        <w:t xml:space="preserve">computed by clipping bisector half-planes and intersecting the result with </w:t>
-      </w:r>
-      <w:r>
-        <w:t>𝒬</w:t>
-      </w:r>
-      <w:r>
-        <w:t xml:space="preserve">. Lloyd’s iteration </w:t>
+        <w:t xml:space="preserve">computed by clipping bisector half-planes and intersecting the result with 𝒬. Lloyd’s iteration </w:t>
       </w:r>
       <w:r>
         <w:rPr>
@@ -903,10 +825,7 @@
         <w:t>i</w:t>
       </w:r>
       <w:r>
-        <w:t xml:space="preserve"> ← centroid(</w:t>
-      </w:r>
-      <w:r>
-        <w:t>𝒫</w:t>
+        <w:t xml:space="preserve"> ← centroid(𝒫</w:t>
       </w:r>
       <w:r>
         <w:rPr>
@@ -988,19 +907,7 @@
                   <w:rPr>
                     <w:rFonts w:ascii="Cambria Math" w:hAnsi="Cambria Math"/>
                   </w:rPr>
-                  <m:t>‖</m:t>
-                </m:r>
-                <m:r>
-                  <w:rPr>
-                    <w:rFonts w:ascii="Cambria Math" w:hAnsi="Cambria Math"/>
-                  </w:rPr>
-                  <m:t>q</m:t>
-                </m:r>
-                <m:r>
-                  <w:rPr>
-                    <w:rFonts w:ascii="Cambria Math" w:hAnsi="Cambria Math"/>
-                  </w:rPr>
-                  <m:t>-</m:t>
+                  <m:t>‖q-</m:t>
                 </m:r>
               </m:e>
             </m:nary>
@@ -1060,13 +967,7 @@
           <w:rPr>
             <w:rFonts w:ascii="Cambria Math" w:hAnsi="Cambria Math"/>
           </w:rPr>
-          <m:t>d</m:t>
-        </m:r>
-        <m:r>
-          <w:rPr>
-            <w:rFonts w:ascii="Cambria Math" w:hAnsi="Cambria Math"/>
-          </w:rPr>
-          <m:t>q</m:t>
+          <m:t>dq</m:t>
         </m:r>
       </m:oMath>
       <w:r>
@@ -1112,13 +1013,7 @@
         <w:t>s</w:t>
       </w:r>
       <w:r>
-        <w:t xml:space="preserve"> = 0.95 m the swath is 1.90 m (overlap of at least 0.45 m). Coverage is scored on a 0.30 m grid: a grid cell inside </w:t>
-      </w:r>
-      <w:r>
-        <w:t>𝒬</w:t>
-      </w:r>
-      <w:r>
-        <w:t xml:space="preserve"> counts once its centre has been within </w:t>
+        <w:t xml:space="preserve"> = 0.95 m the swath is 1.90 m (overlap of at least 0.45 m). Coverage is scored on a 0.30 m grid: a grid cell inside 𝒬 counts once its centre has been within </w:t>
       </w:r>
       <w:r>
         <w:rPr>
@@ -1160,10 +1055,7 @@
         <w:t>k</w:t>
       </w:r>
       <w:r>
-        <w:t xml:space="preserve"> still carried, erases the coverage recorded inside </w:t>
-      </w:r>
-      <w:r>
-        <w:t>𝒫</w:t>
+        <w:t xml:space="preserve"> still carried, erases the coverage recorded inside 𝒫</w:t>
       </w:r>
       <w:r>
         <w:rPr>
@@ -1398,31 +1290,7 @@
           <w:rPr>
             <w:rFonts w:ascii="Cambria Math" w:hAnsi="Cambria Math"/>
           </w:rPr>
-          <m:t>(</m:t>
-        </m:r>
-        <m:r>
-          <w:rPr>
-            <w:rFonts w:ascii="Cambria Math" w:hAnsi="Cambria Math"/>
-          </w:rPr>
-          <m:t>u</m:t>
-        </m:r>
-        <m:r>
-          <w:rPr>
-            <w:rFonts w:ascii="Cambria Math" w:hAnsi="Cambria Math"/>
-          </w:rPr>
-          <m:t>-</m:t>
-        </m:r>
-        <m:r>
-          <w:rPr>
-            <w:rFonts w:ascii="Cambria Math" w:hAnsi="Cambria Math"/>
-          </w:rPr>
-          <m:t>v</m:t>
-        </m:r>
-        <m:r>
-          <w:rPr>
-            <w:rFonts w:ascii="Cambria Math" w:hAnsi="Cambria Math"/>
-          </w:rPr>
-          <m:t>))</m:t>
+          <m:t>(u-v))</m:t>
         </m:r>
       </m:oMath>
       <w:r>
@@ -1493,13 +1361,7 @@
                   <w:rPr>
                     <w:rFonts w:ascii="Cambria Math" w:hAnsi="Cambria Math"/>
                   </w:rPr>
-                  <m:t>=</m:t>
-                </m:r>
-                <m:r>
-                  <w:rPr>
-                    <w:rFonts w:ascii="Cambria Math" w:hAnsi="Cambria Math"/>
-                  </w:rPr>
-                  <m:t>g</m:t>
+                  <m:t>=g</m:t>
                 </m:r>
                 <m:sSub>
                   <m:sSubPr>
@@ -1570,13 +1432,7 @@
                   <w:rPr>
                     <w:rFonts w:ascii="Cambria Math" w:hAnsi="Cambria Math"/>
                   </w:rPr>
-                  <m:t>=</m:t>
-                </m:r>
-                <m:r>
-                  <w:rPr>
-                    <w:rFonts w:ascii="Cambria Math" w:hAnsi="Cambria Math"/>
-                  </w:rPr>
-                  <m:t>g</m:t>
+                  <m:t>=g</m:t>
                 </m:r>
                 <m:r>
                   <m:rPr>
@@ -2034,10 +1890,7 @@
         <w:t>c</w:t>
       </w:r>
       <w:r>
-        <w:t xml:space="preserve"> = 0.680</w:t>
-      </w:r>
-      <w:r>
-        <w:t xml:space="preserve"> m/s. The stopping distance from speed </w:t>
+        <w:t xml:space="preserve"> = 0.680 m/s. The stopping distance from speed </w:t>
       </w:r>
       <w:r>
         <w:rPr>
@@ -2211,13 +2064,7 @@
                   <w:rPr>
                     <w:rFonts w:ascii="Cambria Math" w:hAnsi="Cambria Math"/>
                   </w:rPr>
-                  <m:t>φ</m:t>
-                </m:r>
-                <m:r>
-                  <w:rPr>
-                    <w:rFonts w:ascii="Cambria Math" w:hAnsi="Cambria Math"/>
-                  </w:rPr>
-                  <m:t>(h)=</m:t>
+                  <m:t>φ(h)=</m:t>
                 </m:r>
                 <m:d>
                   <m:dPr>
@@ -2262,13 +2109,7 @@
                             <w:rPr>
                               <w:rFonts w:ascii="Cambria Math" w:hAnsi="Cambria Math"/>
                             </w:rPr>
-                            <m:t>(0,-</m:t>
-                          </m:r>
-                          <m:r>
-                            <w:rPr>
-                              <w:rFonts w:ascii="Cambria Math" w:hAnsi="Cambria Math"/>
-                            </w:rPr>
-                            <m:t>a</m:t>
+                            <m:t>(0,-a</m:t>
                           </m:r>
                           <m:sSub>
                             <m:sSubPr>
@@ -2389,19 +2230,7 @@
                                 <w:rPr>
                                   <w:rFonts w:ascii="Cambria Math" w:hAnsi="Cambria Math"/>
                                 </w:rPr>
-                                <m:t>+2</m:t>
-                              </m:r>
-                              <m:r>
-                                <w:rPr>
-                                  <w:rFonts w:ascii="Cambria Math" w:hAnsi="Cambria Math"/>
-                                </w:rPr>
-                                <m:t>a</m:t>
-                              </m:r>
-                              <m:r>
-                                <w:rPr>
-                                  <w:rFonts w:ascii="Cambria Math" w:hAnsi="Cambria Math"/>
-                                </w:rPr>
-                                <m:t>h-</m:t>
+                                <m:t>+2ah-</m:t>
                               </m:r>
                               <m:sSubSup>
                                 <m:sSubSupPr>
@@ -2645,16 +2474,7 @@
         <w:t>φ</w:t>
       </w:r>
       <w:r>
-        <w:t>(0) = 0</w:t>
-      </w:r>
-      <w:r>
-        <w:t>, but because of this flat segment it is not strictly increasing and hence not a class-</w:t>
-      </w:r>
-      <w:r>
-        <w:t>𝒦</w:t>
-      </w:r>
-      <w:r>
-        <w:t xml:space="preserve"> function in the strict sense; the branch </w:t>
+        <w:t xml:space="preserve">(0) = 0, but because of this flat segment it is not strictly increasing and hence not a class-𝒦 function in the strict sense; the branch </w:t>
       </w:r>
       <w:r>
         <w:rPr>
@@ -2954,25 +2774,7 @@
                   <w:rPr>
                     <w:rFonts w:ascii="Cambria Math" w:hAnsi="Cambria Math"/>
                   </w:rPr>
-                  <m:t>u</m:t>
-                </m:r>
-                <m:r>
-                  <w:rPr>
-                    <w:rFonts w:ascii="Cambria Math" w:hAnsi="Cambria Math"/>
-                  </w:rPr>
-                  <m:t>≤</m:t>
-                </m:r>
-                <m:r>
-                  <w:rPr>
-                    <w:rFonts w:ascii="Cambria Math" w:hAnsi="Cambria Math"/>
-                  </w:rPr>
-                  <m:t>λφ</m:t>
-                </m:r>
-                <m:r>
-                  <w:rPr>
-                    <w:rFonts w:ascii="Cambria Math" w:hAnsi="Cambria Math"/>
-                  </w:rPr>
-                  <m:t>(h)-</m:t>
+                  <m:t>u≤λφ(h)-</m:t>
                 </m:r>
                 <m:sSup>
                   <m:sSupPr>
@@ -3051,49 +2853,7 @@
                   <w:rPr>
                     <w:rFonts w:ascii="Cambria Math" w:hAnsi="Cambria Math"/>
                   </w:rPr>
-                  <m:t>h</m:t>
-                </m:r>
-                <m:r>
-                  <w:rPr>
-                    <w:rFonts w:ascii="Cambria Math" w:hAnsi="Cambria Math"/>
-                  </w:rPr>
-                  <m:t>=‖</m:t>
-                </m:r>
-                <m:r>
-                  <w:rPr>
-                    <w:rFonts w:ascii="Cambria Math" w:hAnsi="Cambria Math"/>
-                  </w:rPr>
-                  <m:t>p</m:t>
-                </m:r>
-                <m:r>
-                  <w:rPr>
-                    <w:rFonts w:ascii="Cambria Math" w:hAnsi="Cambria Math"/>
-                  </w:rPr>
-                  <m:t>-</m:t>
-                </m:r>
-                <m:r>
-                  <w:rPr>
-                    <w:rFonts w:ascii="Cambria Math" w:hAnsi="Cambria Math"/>
-                  </w:rPr>
-                  <m:t>o</m:t>
-                </m:r>
-                <m:r>
-                  <w:rPr>
-                    <w:rFonts w:ascii="Cambria Math" w:hAnsi="Cambria Math"/>
-                  </w:rPr>
-                  <m:t>‖-(</m:t>
-                </m:r>
-                <m:r>
-                  <w:rPr>
-                    <w:rFonts w:ascii="Cambria Math" w:hAnsi="Cambria Math"/>
-                  </w:rPr>
-                  <m:t>ρ</m:t>
-                </m:r>
-                <m:r>
-                  <w:rPr>
-                    <w:rFonts w:ascii="Cambria Math" w:hAnsi="Cambria Math"/>
-                  </w:rPr>
-                  <m:t>+</m:t>
+                  <m:t>h=‖p-o‖-(ρ+</m:t>
                 </m:r>
                 <m:sSub>
                   <m:sSubPr>
@@ -3124,19 +2884,7 @@
                   <w:rPr>
                     <w:rFonts w:ascii="Cambria Math" w:hAnsi="Cambria Math"/>
                   </w:rPr>
-                  <m:t>+</m:t>
-                </m:r>
-                <m:r>
-                  <w:rPr>
-                    <w:rFonts w:ascii="Cambria Math" w:hAnsi="Cambria Math"/>
-                  </w:rPr>
-                  <m:t>δ</m:t>
-                </m:r>
-                <m:r>
-                  <w:rPr>
-                    <w:rFonts w:ascii="Cambria Math" w:hAnsi="Cambria Math"/>
-                  </w:rPr>
-                  <m:t>),</m:t>
+                  <m:t>+δ),</m:t>
                 </m:r>
               </m:oMath>
             </m:oMathPara>
@@ -3366,13 +3114,7 @@
                       <w:rPr>
                         <w:rFonts w:ascii="Cambria Math" w:hAnsi="Cambria Math"/>
                       </w:rPr>
-                      <m:t>u</m:t>
-                    </m:r>
-                    <m:r>
-                      <w:rPr>
-                        <w:rFonts w:ascii="Cambria Math" w:hAnsi="Cambria Math"/>
-                      </w:rPr>
-                      <m:t>∈</m:t>
+                      <m:t>u∈</m:t>
                     </m:r>
                     <m:sSup>
                       <m:sSupPr>
@@ -3408,25 +3150,7 @@
                   <w:rPr>
                     <w:rFonts w:ascii="Cambria Math" w:hAnsi="Cambria Math"/>
                   </w:rPr>
-                  <m:t>‖</m:t>
-                </m:r>
-                <m:r>
-                  <w:rPr>
-                    <w:rFonts w:ascii="Cambria Math" w:hAnsi="Cambria Math"/>
-                  </w:rPr>
-                  <m:t>u</m:t>
-                </m:r>
-                <m:r>
-                  <w:rPr>
-                    <w:rFonts w:ascii="Cambria Math" w:hAnsi="Cambria Math"/>
-                  </w:rPr>
-                  <m:t>-</m:t>
-                </m:r>
-                <m:r>
-                  <w:rPr>
-                    <w:rFonts w:ascii="Cambria Math" w:hAnsi="Cambria Math"/>
-                  </w:rPr>
-                  <m:t>z</m:t>
+                  <m:t>‖u-z</m:t>
                 </m:r>
                 <m:sSup>
                   <m:sSupPr>
@@ -3463,31 +3187,7 @@
                   <w:rPr>
                     <w:rFonts w:ascii="Cambria Math" w:hAnsi="Cambria Math"/>
                   </w:rPr>
-                  <m:t>A</m:t>
-                </m:r>
-                <m:r>
-                  <w:rPr>
-                    <w:rFonts w:ascii="Cambria Math" w:hAnsi="Cambria Math"/>
-                  </w:rPr>
-                  <m:t>u</m:t>
-                </m:r>
-                <m:r>
-                  <w:rPr>
-                    <w:rFonts w:ascii="Cambria Math" w:hAnsi="Cambria Math"/>
-                  </w:rPr>
-                  <m:t>≤</m:t>
-                </m:r>
-                <m:r>
-                  <w:rPr>
-                    <w:rFonts w:ascii="Cambria Math" w:hAnsi="Cambria Math"/>
-                  </w:rPr>
-                  <m:t>b</m:t>
-                </m:r>
-                <m:r>
-                  <w:rPr>
-                    <w:rFonts w:ascii="Cambria Math" w:hAnsi="Cambria Math"/>
-                  </w:rPr>
-                  <m:t>,</m:t>
+                  <m:t>Au≤b,</m:t>
                 </m:r>
                 <m:r>
                   <m:rPr>
@@ -3499,13 +3199,7 @@
                   <w:rPr>
                     <w:rFonts w:ascii="Cambria Math" w:hAnsi="Cambria Math"/>
                   </w:rPr>
-                  <m:t>z</m:t>
-                </m:r>
-                <m:r>
-                  <w:rPr>
-                    <w:rFonts w:ascii="Cambria Math" w:hAnsi="Cambria Math"/>
-                  </w:rPr>
-                  <m:t>=</m:t>
+                  <m:t>z=</m:t>
                 </m:r>
                 <m:f>
                   <m:fPr>
@@ -3548,25 +3242,7 @@
                       <w:rPr>
                         <w:rFonts w:ascii="Cambria Math" w:hAnsi="Cambria Math"/>
                       </w:rPr>
-                      <m:t>+</m:t>
-                    </m:r>
-                    <m:r>
-                      <w:rPr>
-                        <w:rFonts w:ascii="Cambria Math" w:hAnsi="Cambria Math"/>
-                      </w:rPr>
-                      <m:t>t</m:t>
-                    </m:r>
-                    <m:r>
-                      <w:rPr>
-                        <w:rFonts w:ascii="Cambria Math" w:hAnsi="Cambria Math"/>
-                      </w:rPr>
-                      <m:t>+</m:t>
-                    </m:r>
-                    <m:r>
-                      <w:rPr>
-                        <w:rFonts w:ascii="Cambria Math" w:hAnsi="Cambria Math"/>
-                      </w:rPr>
-                      <m:t>w</m:t>
+                      <m:t>+t+w</m:t>
                     </m:r>
                     <m:sSub>
                       <m:sSubPr>
@@ -3602,13 +3278,7 @@
                       <w:rPr>
                         <w:rFonts w:ascii="Cambria Math" w:hAnsi="Cambria Math"/>
                       </w:rPr>
-                      <m:t>1+</m:t>
-                    </m:r>
-                    <m:r>
-                      <w:rPr>
-                        <w:rFonts w:ascii="Cambria Math" w:hAnsi="Cambria Math"/>
-                      </w:rPr>
-                      <m:t>w</m:t>
+                      <m:t>1+w</m:t>
                     </m:r>
                   </m:den>
                 </m:f>
@@ -3705,10 +3375,7 @@
         <w:t>w</w:t>
       </w:r>
       <w:r>
-        <w:t xml:space="preserve"> = 0.25</w:t>
-      </w:r>
-      <w:r>
-        <w:t xml:space="preserve"> smooths successive commands. If the QP is infeasible, soft rows are released (tier 1), then the violation of the hard rows is minimised (tier 2), and a scaled previous command is the last resort (tier 3).</w:t>
+        <w:t xml:space="preserve"> = 0.25 smooths successive commands. If the QP is infeasible, soft rows are released (tier 1), then the violation of the hard rows is minimised (tier 2), and a scaled previous command is the last resort (tier 3).</w:t>
       </w:r>
     </w:p>
     <w:p>
@@ -4077,19 +3744,7 @@
                   <w:rPr>
                     <w:rFonts w:ascii="Cambria Math" w:hAnsi="Cambria Math"/>
                   </w:rPr>
-                  <m:t>P</m:t>
-                </m:r>
-                <m:r>
-                  <w:rPr>
-                    <w:rFonts w:ascii="Cambria Math" w:hAnsi="Cambria Math"/>
-                  </w:rPr>
-                  <m:t>+</m:t>
-                </m:r>
-                <m:r>
-                  <w:rPr>
-                    <w:rFonts w:ascii="Cambria Math" w:hAnsi="Cambria Math"/>
-                  </w:rPr>
-                  <m:t>P</m:t>
+                  <m:t>P+P</m:t>
                 </m:r>
                 <m:sSub>
                   <m:sSubPr>
@@ -4151,19 +3806,7 @@
                   <w:rPr>
                     <w:rFonts w:ascii="Cambria Math" w:hAnsi="Cambria Math"/>
                   </w:rPr>
-                  <m:t>-</m:t>
-                </m:r>
-                <m:r>
-                  <w:rPr>
-                    <w:rFonts w:ascii="Cambria Math" w:hAnsi="Cambria Math"/>
-                  </w:rPr>
-                  <m:t>P</m:t>
-                </m:r>
-                <m:r>
-                  <w:rPr>
-                    <w:rFonts w:ascii="Cambria Math" w:hAnsi="Cambria Math"/>
-                  </w:rPr>
-                  <m:t>(</m:t>
+                  <m:t>-P(</m:t>
                 </m:r>
                 <m:sSub>
                   <m:sSubPr>
@@ -4341,19 +3984,7 @@
                   <w:rPr>
                     <w:rFonts w:ascii="Cambria Math" w:hAnsi="Cambria Math"/>
                   </w:rPr>
-                  <m:t>)</m:t>
-                </m:r>
-                <m:r>
-                  <w:rPr>
-                    <w:rFonts w:ascii="Cambria Math" w:hAnsi="Cambria Math"/>
-                  </w:rPr>
-                  <m:t>P</m:t>
-                </m:r>
-                <m:r>
-                  <w:rPr>
-                    <w:rFonts w:ascii="Cambria Math" w:hAnsi="Cambria Math"/>
-                  </w:rPr>
-                  <m:t>=0,</m:t>
+                  <m:t>)P=0,</m:t>
                 </m:r>
               </m:oMath>
             </m:oMathPara>
@@ -4655,7 +4286,7 @@
                     <pic:cNvPicPr/>
                   </pic:nvPicPr>
                   <pic:blipFill>
-                    <a:blip r:embed="rId11"/>
+                    <a:blip r:embed="rId10"/>
                     <a:stretch>
                       <a:fillRect/>
                     </a:stretch>
@@ -4826,7 +4457,7 @@
                     <pic:cNvPicPr/>
                   </pic:nvPicPr>
                   <pic:blipFill>
-                    <a:blip r:embed="rId12"/>
+                    <a:blip r:embed="rId11"/>
                     <a:stretch>
                       <a:fillRect/>
                     </a:stretch>
@@ -4913,10 +4544,7 @@
         <w:t>∞</w:t>
       </w:r>
       <w:r>
-        <w:t>: always active, clipped to ±0.6</w:t>
-      </w:r>
-      <w:r>
-        <w:t>; PID-LQR: active within 0.25 m, clipped to ±0.4).</w:t>
+        <w:t>: always active, clipped to ±0.6; PID-LQR: active within 0.25 m, clipped to ±0.4).</w:t>
       </w:r>
     </w:p>
     <w:p>
@@ -9499,10 +9127,7 @@
         <w:t>plus</w:t>
       </w:r>
       <w:r>
-        <w:t xml:space="preserve"> missions also include three transit guards (stall detector, speed reduction above 16</w:t>
-      </w:r>
-      <w:r>
-        <w:t xml:space="preserve">° tilt, 20 s start-wait timeout). A mission is complete when every surviving agent has finished its lanes and returned to its cell centroid; a run is stopped if an agent that is not a scheduled victim drops below 0.5 m. Metrics use the 20 Hz controller logs without the first 20 s and without rows after a kill. Lateral error is taken during steady east–west sweeps (heading stable for 1.5 s, speed above 0.6 m/s), torque effort is the mean of </w:t>
+        <w:t xml:space="preserve"> missions also include three transit guards (stall detector, speed reduction above 16° tilt, 20 s start-wait timeout). A mission is complete when every surviving agent has finished its lanes and returned to its cell centroid; a run is stopped if an agent that is not a scheduled victim drops below 0.5 m. Metrics use the 20 Hz controller logs without the first 20 s and without rows after a kill. Lateral error is taken during steady east–west sweeps (heading stable for 1.5 s, speed above 0.6 m/s), torque effort is the mean of </w:t>
       </w:r>
       <w:r>
         <w:rPr>
@@ -9581,7 +9206,7 @@
                     <pic:cNvPicPr/>
                   </pic:nvPicPr>
                   <pic:blipFill>
-                    <a:blip r:embed="rId13"/>
+                    <a:blip r:embed="rId12"/>
                     <a:stretch>
                       <a:fillRect/>
                     </a:stretch>
@@ -9653,10 +9278,7 @@
         <w:t>.</w:t>
       </w:r>
       <w:r>
-        <w:t xml:space="preserve"> </w:t>
-      </w:r>
-      <w:r>
-        <w:t>Flown trajectories of live agents above 0.5 m, including transit from the launch pad (</w:t>
+        <w:t xml:space="preserve"> Flown trajectories of live agents above 0.5 m, including transit from the launch pad (</w:t>
       </w:r>
       <w:r>
         <w:rPr>
@@ -9822,7 +9444,7 @@
                     <pic:cNvPicPr/>
                   </pic:nvPicPr>
                   <pic:blipFill>
-                    <a:blip r:embed="rId14"/>
+                    <a:blip r:embed="rId13"/>
                     <a:stretch>
                       <a:fillRect/>
                     </a:stretch>
@@ -9894,10 +9516,7 @@
         <w:t>.</w:t>
       </w:r>
       <w:r>
-        <w:t xml:space="preserve"> </w:t>
-      </w:r>
-      <w:r>
-        <w:t>Coverage against mission time (coordinator clock). Triangles: agent kills, after which the failed cell is re-swept; dotted: 97% reference level (completion is defined by the survivors finishing their lanes).</w:t>
+        <w:t xml:space="preserve"> Coverage against mission time (coordinator clock). Triangles: agent kills, after which the failed cell is re-swept; dotted: 97% reference level (completion is defined by the survivors finishing their lanes).</w:t>
       </w:r>
     </w:p>
     <w:p>
@@ -9924,7 +9543,7 @@
                     <pic:cNvPicPr/>
                   </pic:nvPicPr>
                   <pic:blipFill>
-                    <a:blip r:embed="rId15"/>
+                    <a:blip r:embed="rId14"/>
                     <a:stretch>
                       <a:fillRect/>
                     </a:stretch>
@@ -10141,10 +9760,7 @@
         <w:t>★</w:t>
       </w:r>
       <w:r>
-        <w:t xml:space="preserve"> ≈ 0.4</w:t>
-      </w:r>
-      <w:r>
-        <w:t> m, this happened in 36–45% of its sweep samples. Mean sweep speeds of 1.15–1.21 against 1.02–1.12 m/s (command 1.6 m/s) contribute to the 11–15% shorter missions; the 95th-percentile tilt was essentially equal, as was altitude error outside the two missions with upsets. In the linear analysis (Table </w:t>
+        <w:t xml:space="preserve"> ≈ 0.4 m, this happened in 36–45% of its sweep samples. Mean sweep speeds of 1.15–1.21 against 1.02–1.12 m/s (command 1.6 m/s) contribute to the 11–15% shorter missions; the 95th-percentile tilt was essentially equal, as was altitude error outside the two missions with upsets. In the linear analysis (Table </w:t>
       </w:r>
       <w:r>
         <w:fldChar w:fldCharType="begin"/>
@@ -10385,7 +10001,7 @@
                     <pic:cNvPicPr/>
                   </pic:nvPicPr>
                   <pic:blipFill>
-                    <a:blip r:embed="rId16"/>
+                    <a:blip r:embed="rId15"/>
                     <a:stretch>
                       <a:fillRect/>
                     </a:stretch>
@@ -10457,10 +10073,7 @@
         <w:t>.</w:t>
       </w:r>
       <w:r>
-        <w:t xml:space="preserve"> </w:t>
-      </w:r>
-      <w:r>
-        <w:t>(a) Absolute lateral error in steady east–west sweeps (box: quartiles, whiskers: 5th–95th percentiles). (b) RMS lateral error against torque effort. (c) Disturbance-to-position gain of the linearised outer loop; dotted: wind-model corner frequency.</w:t>
+        <w:t xml:space="preserve"> (a) Absolute lateral error in steady east–west sweeps (box: quartiles, whiskers: 5th–95th percentiles). (b) RMS lateral error against torque effort. (c) Disturbance-to-position gain of the linearised outer loop; dotted: wind-model corner frequency.</w:t>
       </w:r>
     </w:p>
     <w:p>
@@ -10487,7 +10100,7 @@
                     <pic:cNvPicPr/>
                   </pic:nvPicPr>
                   <pic:blipFill>
-                    <a:blip r:embed="rId17"/>
+                    <a:blip r:embed="rId16"/>
                     <a:stretch>
                       <a:fillRect/>
                     </a:stretch>
@@ -11111,6 +10724,44 @@
     </w:sectPr>
   </w:body>
 </w:document>
+</file>
+
+<file path=word/endnotes.xml><?xml version="1.0" encoding="utf-8"?>
+<w:endnotes xmlns:wpc="http://schemas.microsoft.com/office/word/2010/wordprocessingCanvas" xmlns:cx="http://schemas.microsoft.com/office/drawing/2014/chartex" xmlns:cx1="http://schemas.microsoft.com/office/drawing/2015/9/8/chartex" xmlns:cx2="http://schemas.microsoft.com/office/drawing/2015/10/21/chartex" xmlns:cx3="http://schemas.microsoft.com/office/drawing/2016/5/9/chartex" xmlns:cx4="http://schemas.microsoft.com/office/drawing/2016/5/10/chartex" xmlns:cx5="http://schemas.microsoft.com/office/drawing/2016/5/11/chartex" xmlns:cx6="http://schemas.microsoft.com/office/drawing/2016/5/12/chartex" xmlns:cx7="http://schemas.microsoft.com/office/drawing/2016/5/13/chartex" xmlns:cx8="http://schemas.microsoft.com/office/drawing/2016/5/14/chartex" xmlns:mc="http://schemas.openxmlformats.org/markup-compatibility/2006" xmlns:aink="http://schemas.microsoft.com/office/drawing/2016/ink" xmlns:am3d="http://schemas.microsoft.com/office/drawing/2017/model3d" xmlns:o="urn:schemas-microsoft-com:office:office" xmlns:oel="http://schemas.microsoft.com/office/2019/extlst" xmlns:r="http://schemas.openxmlformats.org/officeDocument/2006/relationships" xmlns:m="http://schemas.openxmlformats.org/officeDocument/2006/math" xmlns:v="urn:schemas-microsoft-com:vml" xmlns:wp14="http://schemas.microsoft.com/office/word/2010/wordprocessingDrawing" xmlns:wp="http://schemas.openxmlformats.org/drawingml/2006/wordprocessingDrawing" xmlns:w10="urn:schemas-microsoft-com:office:word" xmlns:w="http://schemas.openxmlformats.org/wordprocessingml/2006/main" xmlns:w14="http://schemas.microsoft.com/office/word/2010/wordml" xmlns:w15="http://schemas.microsoft.com/office/word/2012/wordml" xmlns:w16cex="http://schemas.microsoft.com/office/word/2018/wordml/cex" xmlns:w16cid="http://schemas.microsoft.com/office/word/2016/wordml/cid" xmlns:w16="http://schemas.microsoft.com/office/word/2018/wordml" xmlns:w16du="http://schemas.microsoft.com/office/word/2023/wordml/word16du" xmlns:w16sdtdh="http://schemas.microsoft.com/office/word/2020/wordml/sdtdatahash" xmlns:w16sdtfl="http://schemas.microsoft.com/office/word/2024/wordml/sdtformatlock" xmlns:w16se="http://schemas.microsoft.com/office/word/2015/wordml/symex" xmlns:wpg="http://schemas.microsoft.com/office/word/2010/wordprocessingGroup" xmlns:wpi="http://schemas.microsoft.com/office/word/2010/wordprocessingInk" xmlns:wne="http://schemas.microsoft.com/office/word/2006/wordml" xmlns:wps="http://schemas.microsoft.com/office/word/2010/wordprocessingShape" mc:Ignorable="w14 w15 w16se w16cid w16 w16cex w16sdtdh w16sdtfl w16du wp14">
+  <w:endnote w:type="separator" w:id="-1">
+    <w:p>
+      <w:r>
+        <w:separator/>
+      </w:r>
+    </w:p>
+  </w:endnote>
+  <w:endnote w:type="continuationSeparator" w:id="0">
+    <w:p>
+      <w:r>
+        <w:continuationSeparator/>
+      </w:r>
+    </w:p>
+  </w:endnote>
+</w:endnotes>
+</file>
+
+<file path=word/footnotes.xml><?xml version="1.0" encoding="utf-8"?>
+<w:footnotes xmlns:wpc="http://schemas.microsoft.com/office/word/2010/wordprocessingCanvas" xmlns:cx="http://schemas.microsoft.com/office/drawing/2014/chartex" xmlns:cx1="http://schemas.microsoft.com/office/drawing/2015/9/8/chartex" xmlns:cx2="http://schemas.microsoft.com/office/drawing/2015/10/21/chartex" xmlns:cx3="http://schemas.microsoft.com/office/drawing/2016/5/9/chartex" xmlns:cx4="http://schemas.microsoft.com/office/drawing/2016/5/10/chartex" xmlns:cx5="http://schemas.microsoft.com/office/drawing/2016/5/11/chartex" xmlns:cx6="http://schemas.microsoft.com/office/drawing/2016/5/12/chartex" xmlns:cx7="http://schemas.microsoft.com/office/drawing/2016/5/13/chartex" xmlns:cx8="http://schemas.microsoft.com/office/drawing/2016/5/14/chartex" xmlns:mc="http://schemas.openxmlformats.org/markup-compatibility/2006" xmlns:aink="http://schemas.microsoft.com/office/drawing/2016/ink" xmlns:am3d="http://schemas.microsoft.com/office/drawing/2017/model3d" xmlns:o="urn:schemas-microsoft-com:office:office" xmlns:oel="http://schemas.microsoft.com/office/2019/extlst" xmlns:r="http://schemas.openxmlformats.org/officeDocument/2006/relationships" xmlns:m="http://schemas.openxmlformats.org/officeDocument/2006/math" xmlns:v="urn:schemas-microsoft-com:vml" xmlns:wp14="http://schemas.microsoft.com/office/word/2010/wordprocessingDrawing" xmlns:wp="http://schemas.openxmlformats.org/drawingml/2006/wordprocessingDrawing" xmlns:w10="urn:schemas-microsoft-com:office:word" xmlns:w="http://schemas.openxmlformats.org/wordprocessingml/2006/main" xmlns:w14="http://schemas.microsoft.com/office/word/2010/wordml" xmlns:w15="http://schemas.microsoft.com/office/word/2012/wordml" xmlns:w16cex="http://schemas.microsoft.com/office/word/2018/wordml/cex" xmlns:w16cid="http://schemas.microsoft.com/office/word/2016/wordml/cid" xmlns:w16="http://schemas.microsoft.com/office/word/2018/wordml" xmlns:w16du="http://schemas.microsoft.com/office/word/2023/wordml/word16du" xmlns:w16sdtdh="http://schemas.microsoft.com/office/word/2020/wordml/sdtdatahash" xmlns:w16sdtfl="http://schemas.microsoft.com/office/word/2024/wordml/sdtformatlock" xmlns:w16se="http://schemas.microsoft.com/office/word/2015/wordml/symex" xmlns:wpg="http://schemas.microsoft.com/office/word/2010/wordprocessingGroup" xmlns:wpi="http://schemas.microsoft.com/office/word/2010/wordprocessingInk" xmlns:wne="http://schemas.microsoft.com/office/word/2006/wordml" xmlns:wps="http://schemas.microsoft.com/office/word/2010/wordprocessingShape" mc:Ignorable="w14 w15 w16se w16cid w16 w16cex w16sdtdh w16sdtfl w16du wp14">
+  <w:footnote w:type="separator" w:id="-1">
+    <w:p>
+      <w:r>
+        <w:separator/>
+      </w:r>
+    </w:p>
+  </w:footnote>
+  <w:footnote w:type="continuationSeparator" w:id="0">
+    <w:p>
+      <w:r>
+        <w:continuationSeparator/>
+      </w:r>
+    </w:p>
+  </w:footnote>
+</w:footnotes>
 </file>
 
 <file path=word/numbering.xml><?xml version="1.0" encoding="utf-8"?>
@@ -13674,6 +13325,52 @@
       <w:lang w:val="en-US" w:eastAsia="en-US"/>
     </w:rPr>
   </w:style>
+  <w:style w:type="paragraph" w:styleId="Header">
+    <w:name w:val="header"/>
+    <w:basedOn w:val="Normal"/>
+    <w:link w:val="HeaderChar"/>
+    <w:unhideWhenUsed/>
+    <w:rsid w:val="00AA708D"/>
+    <w:pPr>
+      <w:tabs>
+        <w:tab w:val="center" w:pos="4513"/>
+        <w:tab w:val="right" w:pos="9026"/>
+      </w:tabs>
+    </w:pPr>
+  </w:style>
+  <w:style w:type="character" w:customStyle="1" w:styleId="HeaderChar">
+    <w:name w:val="Header Char"/>
+    <w:basedOn w:val="DefaultParagraphFont"/>
+    <w:link w:val="Header"/>
+    <w:rsid w:val="00AA708D"/>
+    <w:rPr>
+      <w:sz w:val="24"/>
+      <w:lang w:val="en-US" w:eastAsia="en-US"/>
+    </w:rPr>
+  </w:style>
+  <w:style w:type="paragraph" w:styleId="Footer">
+    <w:name w:val="footer"/>
+    <w:basedOn w:val="Normal"/>
+    <w:link w:val="FooterChar"/>
+    <w:unhideWhenUsed/>
+    <w:rsid w:val="00AA708D"/>
+    <w:pPr>
+      <w:tabs>
+        <w:tab w:val="center" w:pos="4513"/>
+        <w:tab w:val="right" w:pos="9026"/>
+      </w:tabs>
+    </w:pPr>
+  </w:style>
+  <w:style w:type="character" w:customStyle="1" w:styleId="FooterChar">
+    <w:name w:val="Footer Char"/>
+    <w:basedOn w:val="DefaultParagraphFont"/>
+    <w:link w:val="Footer"/>
+    <w:rsid w:val="00AA708D"/>
+    <w:rPr>
+      <w:sz w:val="24"/>
+      <w:lang w:val="en-US" w:eastAsia="en-US"/>
+    </w:rPr>
+  </w:style>
 </w:styles>
 </file>
 
@@ -13963,249 +13660,13 @@
 </file>
 
 <file path=customXml/item1.xml><?xml version="1.0" encoding="utf-8"?>
-<ct:contentTypeSchema xmlns:ct="http://schemas.microsoft.com/office/2006/metadata/contentType" xmlns:ma="http://schemas.microsoft.com/office/2006/metadata/properties/metaAttributes" ct:_="" ma:_="" ma:contentTypeName="Document" ma:contentTypeID="0x010100846995F60857E14C80FE53F9695AA2C6" ma:contentTypeVersion="7" ma:contentTypeDescription="Create a new document." ma:contentTypeScope="" ma:versionID="38c5f35686c3c4cec37769de32b93b97">
-  <xsd:schema xmlns:xsd="http://www.w3.org/2001/XMLSchema" xmlns:xs="http://www.w3.org/2001/XMLSchema" xmlns:p="http://schemas.microsoft.com/office/2006/metadata/properties" xmlns:ns2="62f7b773-16dd-4b3c-b599-ed9bfcbd904f" xmlns:ns3="c3a8a8ca-00e5-416b-a184-163173e53f53" targetNamespace="http://schemas.microsoft.com/office/2006/metadata/properties" ma:root="true" ma:fieldsID="c7a00eb472d1264d625833f449ae8108" ns2:_="" ns3:_="">
-    <xsd:import namespace="62f7b773-16dd-4b3c-b599-ed9bfcbd904f"/>
-    <xsd:import namespace="c3a8a8ca-00e5-416b-a184-163173e53f53"/>
-    <xsd:element name="properties">
-      <xsd:complexType>
-        <xsd:sequence>
-          <xsd:element name="documentManagement">
-            <xsd:complexType>
-              <xsd:all>
-                <xsd:element ref="ns2:MediaServiceMetadata" minOccurs="0"/>
-                <xsd:element ref="ns2:MediaServiceFastMetadata" minOccurs="0"/>
-                <xsd:element ref="ns2:MediaServiceAutoKeyPoints" minOccurs="0"/>
-                <xsd:element ref="ns2:MediaServiceKeyPoints" minOccurs="0"/>
-                <xsd:element ref="ns3:SharedWithUsers" minOccurs="0"/>
-                <xsd:element ref="ns3:SharedWithDetails" minOccurs="0"/>
-                <xsd:element ref="ns2:MediaServiceDateTaken" minOccurs="0"/>
-              </xsd:all>
-            </xsd:complexType>
-          </xsd:element>
-        </xsd:sequence>
-      </xsd:complexType>
-    </xsd:element>
-  </xsd:schema>
-  <xsd:schema xmlns:xsd="http://www.w3.org/2001/XMLSchema" xmlns:xs="http://www.w3.org/2001/XMLSchema" xmlns:dms="http://schemas.microsoft.com/office/2006/documentManagement/types" xmlns:pc="http://schemas.microsoft.com/office/infopath/2007/PartnerControls" targetNamespace="62f7b773-16dd-4b3c-b599-ed9bfcbd904f" elementFormDefault="qualified">
-    <xsd:import namespace="http://schemas.microsoft.com/office/2006/documentManagement/types"/>
-    <xsd:import namespace="http://schemas.microsoft.com/office/infopath/2007/PartnerControls"/>
-    <xsd:element name="MediaServiceMetadata" ma:index="8" nillable="true" ma:displayName="MediaServiceMetadata" ma:hidden="true" ma:internalName="MediaServiceMetadata" ma:readOnly="true">
-      <xsd:simpleType>
-        <xsd:restriction base="dms:Note"/>
-      </xsd:simpleType>
-    </xsd:element>
-    <xsd:element name="MediaServiceFastMetadata" ma:index="9" nillable="true" ma:displayName="MediaServiceFastMetadata" ma:hidden="true" ma:internalName="MediaServiceFastMetadata" ma:readOnly="true">
-      <xsd:simpleType>
-        <xsd:restriction base="dms:Note"/>
-      </xsd:simpleType>
-    </xsd:element>
-    <xsd:element name="MediaServiceAutoKeyPoints" ma:index="10" nillable="true" ma:displayName="MediaServiceAutoKeyPoints" ma:hidden="true" ma:internalName="MediaServiceAutoKeyPoints" ma:readOnly="true">
-      <xsd:simpleType>
-        <xsd:restriction base="dms:Note"/>
-      </xsd:simpleType>
-    </xsd:element>
-    <xsd:element name="MediaServiceKeyPoints" ma:index="11" nillable="true" ma:displayName="KeyPoints" ma:internalName="MediaServiceKeyPoints" ma:readOnly="true">
-      <xsd:simpleType>
-        <xsd:restriction base="dms:Note">
-          <xsd:maxLength value="255"/>
-        </xsd:restriction>
-      </xsd:simpleType>
-    </xsd:element>
-    <xsd:element name="MediaServiceDateTaken" ma:index="14" nillable="true" ma:displayName="MediaServiceDateTaken" ma:hidden="true" ma:internalName="MediaServiceDateTaken" ma:readOnly="true">
-      <xsd:simpleType>
-        <xsd:restriction base="dms:Text"/>
-      </xsd:simpleType>
-    </xsd:element>
-  </xsd:schema>
-  <xsd:schema xmlns:xsd="http://www.w3.org/2001/XMLSchema" xmlns:xs="http://www.w3.org/2001/XMLSchema" xmlns:dms="http://schemas.microsoft.com/office/2006/documentManagement/types" xmlns:pc="http://schemas.microsoft.com/office/infopath/2007/PartnerControls" targetNamespace="c3a8a8ca-00e5-416b-a184-163173e53f53" elementFormDefault="qualified">
-    <xsd:import namespace="http://schemas.microsoft.com/office/2006/documentManagement/types"/>
-    <xsd:import namespace="http://schemas.microsoft.com/office/infopath/2007/PartnerControls"/>
-    <xsd:element name="SharedWithUsers" ma:index="12" nillable="true" ma:displayName="Shared With" ma:internalName="SharedWithUsers" ma:readOnly="true">
-      <xsd:complexType>
-        <xsd:complexContent>
-          <xsd:extension base="dms:UserMulti">
-            <xsd:sequence>
-              <xsd:element name="UserInfo" minOccurs="0" maxOccurs="unbounded">
-                <xsd:complexType>
-                  <xsd:sequence>
-                    <xsd:element name="DisplayName" type="xsd:string" minOccurs="0"/>
-                    <xsd:element name="AccountId" type="dms:UserId" minOccurs="0" nillable="true"/>
-                    <xsd:element name="AccountType" type="xsd:string" minOccurs="0"/>
-                  </xsd:sequence>
-                </xsd:complexType>
-              </xsd:element>
-            </xsd:sequence>
-          </xsd:extension>
-        </xsd:complexContent>
-      </xsd:complexType>
-    </xsd:element>
-    <xsd:element name="SharedWithDetails" ma:index="13" nillable="true" ma:displayName="Shared With Details" ma:internalName="SharedWithDetails" ma:readOnly="true">
-      <xsd:simpleType>
-        <xsd:restriction base="dms:Note">
-          <xsd:maxLength value="255"/>
-        </xsd:restriction>
-      </xsd:simpleType>
-    </xsd:element>
-  </xsd:schema>
-  <xsd:schema xmlns="http://schemas.openxmlformats.org/package/2006/metadata/core-properties" xmlns:xsd="http://www.w3.org/2001/XMLSchema" xmlns:xsi="http://www.w3.org/2001/XMLSchema-instance" xmlns:dc="http://purl.org/dc/elements/1.1/" xmlns:dcterms="http://purl.org/dc/terms/" xmlns:odoc="http://schemas.microsoft.com/internal/obd" targetNamespace="http://schemas.openxmlformats.org/package/2006/metadata/core-properties" elementFormDefault="qualified" attributeFormDefault="unqualified" blockDefault="#all">
-    <xsd:import namespace="http://purl.org/dc/elements/1.1/" schemaLocation="http://dublincore.org/schemas/xmls/qdc/2003/04/02/dc.xsd"/>
-    <xsd:import namespace="http://purl.org/dc/terms/" schemaLocation="http://dublincore.org/schemas/xmls/qdc/2003/04/02/dcterms.xsd"/>
-    <xsd:element name="coreProperties" type="CT_coreProperties"/>
-    <xsd:complexType name="CT_coreProperties">
-      <xsd:all>
-        <xsd:element ref="dc:creator" minOccurs="0" maxOccurs="1"/>
-        <xsd:element ref="dcterms:created" minOccurs="0" maxOccurs="1"/>
-        <xsd:element ref="dc:identifier" minOccurs="0" maxOccurs="1"/>
-        <xsd:element name="contentType" minOccurs="0" maxOccurs="1" type="xsd:string" ma:index="0" ma:displayName="Content Type"/>
-        <xsd:element ref="dc:title" minOccurs="0" maxOccurs="1" ma:index="4" ma:displayName="Title"/>
-        <xsd:element ref="dc:subject" minOccurs="0" maxOccurs="1"/>
-        <xsd:element ref="dc:description" minOccurs="0" maxOccurs="1"/>
-        <xsd:element name="keywords" minOccurs="0" maxOccurs="1" type="xsd:string"/>
-        <xsd:element ref="dc:language" minOccurs="0" maxOccurs="1"/>
-        <xsd:element name="category" minOccurs="0" maxOccurs="1" type="xsd:string"/>
-        <xsd:element name="version" minOccurs="0" maxOccurs="1" type="xsd:string"/>
-        <xsd:element name="revision" minOccurs="0" maxOccurs="1" type="xsd:string">
-          <xsd:annotation>
-            <xsd:documentation>
-                        This value indicates the number of saves or revisions. The application is responsible for updating this value after each revision.
-                    </xsd:documentation>
-          </xsd:annotation>
-        </xsd:element>
-        <xsd:element name="lastModifiedBy" minOccurs="0" maxOccurs="1" type="xsd:string"/>
-        <xsd:element ref="dcterms:modified" minOccurs="0" maxOccurs="1"/>
-        <xsd:element name="contentStatus" minOccurs="0" maxOccurs="1" type="xsd:string"/>
-      </xsd:all>
-    </xsd:complexType>
-  </xsd:schema>
-  <xs:schema xmlns:pc="http://schemas.microsoft.com/office/infopath/2007/PartnerControls" xmlns:xs="http://www.w3.org/2001/XMLSchema" targetNamespace="http://schemas.microsoft.com/office/infopath/2007/PartnerControls" elementFormDefault="qualified" attributeFormDefault="unqualified">
-    <xs:element name="Person">
-      <xs:complexType>
-        <xs:sequence>
-          <xs:element ref="pc:DisplayName" minOccurs="0"/>
-          <xs:element ref="pc:AccountId" minOccurs="0"/>
-          <xs:element ref="pc:AccountType" minOccurs="0"/>
-        </xs:sequence>
-      </xs:complexType>
-    </xs:element>
-    <xs:element name="DisplayName" type="xs:string"/>
-    <xs:element name="AccountId" type="xs:string"/>
-    <xs:element name="AccountType" type="xs:string"/>
-    <xs:element name="BDCAssociatedEntity">
-      <xs:complexType>
-        <xs:sequence>
-          <xs:element ref="pc:BDCEntity" minOccurs="0" maxOccurs="unbounded"/>
-        </xs:sequence>
-        <xs:attribute ref="pc:EntityNamespace"/>
-        <xs:attribute ref="pc:EntityName"/>
-        <xs:attribute ref="pc:SystemInstanceName"/>
-        <xs:attribute ref="pc:AssociationName"/>
-      </xs:complexType>
-    </xs:element>
-    <xs:attribute name="EntityNamespace" type="xs:string"/>
-    <xs:attribute name="EntityName" type="xs:string"/>
-    <xs:attribute name="SystemInstanceName" type="xs:string"/>
-    <xs:attribute name="AssociationName" type="xs:string"/>
-    <xs:element name="BDCEntity">
-      <xs:complexType>
-        <xs:sequence>
-          <xs:element ref="pc:EntityDisplayName" minOccurs="0"/>
-          <xs:element ref="pc:EntityInstanceReference" minOccurs="0"/>
-          <xs:element ref="pc:EntityId1" minOccurs="0"/>
-          <xs:element ref="pc:EntityId2" minOccurs="0"/>
-          <xs:element ref="pc:EntityId3" minOccurs="0"/>
-          <xs:element ref="pc:EntityId4" minOccurs="0"/>
-          <xs:element ref="pc:EntityId5" minOccurs="0"/>
-        </xs:sequence>
-      </xs:complexType>
-    </xs:element>
-    <xs:element name="EntityDisplayName" type="xs:string"/>
-    <xs:element name="EntityInstanceReference" type="xs:string"/>
-    <xs:element name="EntityId1" type="xs:string"/>
-    <xs:element name="EntityId2" type="xs:string"/>
-    <xs:element name="EntityId3" type="xs:string"/>
-    <xs:element name="EntityId4" type="xs:string"/>
-    <xs:element name="EntityId5" type="xs:string"/>
-    <xs:element name="Terms">
-      <xs:complexType>
-        <xs:sequence>
-          <xs:element ref="pc:TermInfo" minOccurs="0" maxOccurs="unbounded"/>
-        </xs:sequence>
-      </xs:complexType>
-    </xs:element>
-    <xs:element name="TermInfo">
-      <xs:complexType>
-        <xs:sequence>
-          <xs:element ref="pc:TermName" minOccurs="0"/>
-          <xs:element ref="pc:TermId" minOccurs="0"/>
-        </xs:sequence>
-      </xs:complexType>
-    </xs:element>
-    <xs:element name="TermName" type="xs:string"/>
-    <xs:element name="TermId" type="xs:string"/>
-  </xs:schema>
-</ct:contentTypeSchema>
-</file>
-
-<file path=customXml/item2.xml><?xml version="1.0" encoding="utf-8"?>
 <b:Sources xmlns:b="http://schemas.openxmlformats.org/officeDocument/2006/bibliography" xmlns="http://schemas.openxmlformats.org/officeDocument/2006/bibliography" SelectedStyle="\APA.XSL" StyleName="APA"/>
 </file>
 
-<file path=customXml/item3.xml><?xml version="1.0" encoding="utf-8"?>
-<p:properties xmlns:p="http://schemas.microsoft.com/office/2006/metadata/properties" xmlns:xsi="http://www.w3.org/2001/XMLSchema-instance" xmlns:pc="http://schemas.microsoft.com/office/infopath/2007/PartnerControls">
-  <documentManagement/>
-</p:properties>
-</file>
-
-<file path=customXml/item4.xml><?xml version="1.0" encoding="utf-8"?>
-<?mso-contentType ?>
-<FormTemplates xmlns="http://schemas.microsoft.com/sharepoint/v3/contenttype/forms">
-  <Display>DocumentLibraryForm</Display>
-  <Edit>DocumentLibraryForm</Edit>
-  <New>DocumentLibraryForm</New>
-</FormTemplates>
-</file>
-
 <file path=customXml/itemProps1.xml><?xml version="1.0" encoding="utf-8"?>
-<ds:datastoreItem xmlns:ds="http://schemas.openxmlformats.org/officeDocument/2006/customXml" ds:itemID="{CF065601-3004-4BED-8BEF-2E59F4003D3F}">
-  <ds:schemaRefs>
-    <ds:schemaRef ds:uri="http://schemas.microsoft.com/office/2006/metadata/contentType"/>
-    <ds:schemaRef ds:uri="http://schemas.microsoft.com/office/2006/metadata/properties/metaAttributes"/>
-    <ds:schemaRef ds:uri="http://www.w3.org/2001/XMLSchema"/>
-    <ds:schemaRef ds:uri="http://schemas.microsoft.com/office/2006/metadata/properties"/>
-    <ds:schemaRef ds:uri="62f7b773-16dd-4b3c-b599-ed9bfcbd904f"/>
-    <ds:schemaRef ds:uri="c3a8a8ca-00e5-416b-a184-163173e53f53"/>
-    <ds:schemaRef ds:uri="http://schemas.microsoft.com/office/2006/documentManagement/types"/>
-    <ds:schemaRef ds:uri="http://schemas.microsoft.com/office/infopath/2007/PartnerControls"/>
-    <ds:schemaRef ds:uri="http://schemas.openxmlformats.org/package/2006/metadata/core-properties"/>
-    <ds:schemaRef ds:uri="http://purl.org/dc/elements/1.1/"/>
-    <ds:schemaRef ds:uri="http://purl.org/dc/terms/"/>
-    <ds:schemaRef ds:uri="http://schemas.microsoft.com/internal/obd"/>
-  </ds:schemaRefs>
-</ds:datastoreItem>
-</file>
-
-<file path=customXml/itemProps2.xml><?xml version="1.0" encoding="utf-8"?>
 <ds:datastoreItem xmlns:ds="http://schemas.openxmlformats.org/officeDocument/2006/customXml" ds:itemID="{0697ED27-AAD2-43E1-AA38-35C328735191}">
   <ds:schemaRefs>
     <ds:schemaRef ds:uri="http://schemas.openxmlformats.org/officeDocument/2006/bibliography"/>
   </ds:schemaRefs>
 </ds:datastoreItem>
-</file>
-
-<file path=customXml/itemProps3.xml><?xml version="1.0" encoding="utf-8"?>
-<ds:datastoreItem xmlns:ds="http://schemas.openxmlformats.org/officeDocument/2006/customXml" ds:itemID="{B23F62D3-EB58-423F-9DEC-FB3FD7A72760}">
-  <ds:schemaRefs>
-    <ds:schemaRef ds:uri="http://schemas.microsoft.com/office/2006/metadata/properties"/>
-    <ds:schemaRef ds:uri="http://schemas.microsoft.com/office/infopath/2007/PartnerControls"/>
-  </ds:schemaRefs>
-</ds:datastoreItem>
-</file>
-
-<file path=customXml/itemProps4.xml><?xml version="1.0" encoding="utf-8"?>
-<ds:datastoreItem xmlns:ds="http://schemas.openxmlformats.org/officeDocument/2006/customXml" ds:itemID="{0844FC6D-7350-442F-8936-25B8D55E2C0C}">
-  <ds:schemaRefs>
-    <ds:schemaRef ds:uri="http://schemas.microsoft.com/sharepoint/v3/contenttype/forms"/>
-  </ds:schemaRefs>
-</ds:datastoreItem>
 </file>
</xml_diff>